<commit_message>
Updated with github repository link
</commit_message>
<xml_diff>
--- a/How to run/Test model manual.docx
+++ b/How to run/Test model manual.docx
@@ -74,30 +74,8 @@
         <w:rPr>
           <w:lang w:val="en-GB"/>
         </w:rPr>
-        <w:t xml:space="preserve">interfacing between </w:t>
-      </w:r>
-      <w:proofErr w:type="spellStart"/>
-      <w:r>
-        <w:rPr>
-          <w:lang w:val="en-GB"/>
-        </w:rPr>
-        <w:t>Matlab</w:t>
-      </w:r>
-      <w:proofErr w:type="spellEnd"/>
-      <w:r>
-        <w:rPr>
-          <w:lang w:val="en-GB"/>
-        </w:rPr>
-        <w:t xml:space="preserve"> and </w:t>
-      </w:r>
-      <w:proofErr w:type="spellStart"/>
-      <w:r>
-        <w:rPr>
-          <w:lang w:val="en-GB"/>
-        </w:rPr>
-        <w:t>CANoe</w:t>
-      </w:r>
-      <w:proofErr w:type="spellEnd"/>
+        <w:t>interfacing between Matlab and CANoe</w:t>
+      </w:r>
       <w:r>
         <w:rPr>
           <w:lang w:val="en-GB"/>
@@ -149,20 +127,114 @@
     </w:p>
     <w:p>
       <w:pPr>
-        <w:pStyle w:val="Heading2"/>
-        <w:rPr>
-          <w:lang w:val="en-GB"/>
-        </w:rPr>
-      </w:pPr>
-      <w:r>
-        <w:rPr>
-          <w:lang w:val="en-GB"/>
-        </w:rPr>
-        <w:t>Structure</w:t>
+        <w:rPr>
+          <w:rFonts w:asciiTheme="majorHAnsi" w:eastAsiaTheme="majorEastAsia" w:hAnsiTheme="majorHAnsi" w:cstheme="majorBidi"/>
+          <w:color w:val="0F4761" w:themeColor="accent1" w:themeShade="BF"/>
+          <w:sz w:val="32"/>
+          <w:szCs w:val="32"/>
+          <w:lang w:val="en-GB"/>
+        </w:rPr>
+      </w:pPr>
+      <w:r>
+        <w:rPr>
+          <w:rFonts w:asciiTheme="majorHAnsi" w:eastAsiaTheme="majorEastAsia" w:hAnsiTheme="majorHAnsi" w:cstheme="majorBidi"/>
+          <w:color w:val="0F4761" w:themeColor="accent1" w:themeShade="BF"/>
+          <w:sz w:val="32"/>
+          <w:szCs w:val="32"/>
+          <w:lang w:val="en-GB"/>
+        </w:rPr>
+        <w:t>How to get the test model</w:t>
       </w:r>
     </w:p>
     <w:p>
       <w:pPr>
+        <w:pStyle w:val="NoSpacing"/>
+        <w:rPr>
+          <w:lang w:val="en-GB"/>
+        </w:rPr>
+      </w:pPr>
+      <w:r>
+        <w:rPr>
+          <w:lang w:val="en-GB"/>
+        </w:rPr>
+        <w:t xml:space="preserve">Github link: </w:t>
+      </w:r>
+      <w:hyperlink r:id="rId9" w:history="1">
+        <w:r>
+          <w:rPr>
+            <w:rStyle w:val="Hyperlink"/>
+            <w:lang w:val="en-GB"/>
+          </w:rPr>
+          <w:t>https://github.com/aj2301vc/DIM_iCUP.git</w:t>
+        </w:r>
+      </w:hyperlink>
+      <w:r>
+        <w:rPr>
+          <w:lang w:val="en-GB"/>
+        </w:rPr>
+        <w:br/>
+      </w:r>
+      <w:r>
+        <w:rPr>
+          <w:lang w:val="en-GB"/>
+        </w:rPr>
+        <w:t xml:space="preserve">Either clone the repository or download the zip. </w:t>
+      </w:r>
+    </w:p>
+    <w:p>
+      <w:pPr>
+        <w:pStyle w:val="NoSpacing"/>
+        <w:rPr>
+          <w:lang w:val="en-GB"/>
+        </w:rPr>
+      </w:pPr>
+      <w:r>
+        <w:rPr>
+          <w:lang w:val="en-GB"/>
+        </w:rPr>
+        <w:t>(</w:t>
+      </w:r>
+      <w:r>
+        <w:rPr>
+          <w:lang w:val="en-GB"/>
+        </w:rPr>
+        <w:t xml:space="preserve">In </w:t>
+      </w:r>
+      <w:r>
+        <w:rPr>
+          <w:lang w:val="en-GB"/>
+        </w:rPr>
+        <w:t xml:space="preserve">conf_DSF.m file, change the </w:t>
+      </w:r>
+      <w:r>
+        <w:rPr>
+          <w:lang w:val="en-GB"/>
+        </w:rPr>
+        <w:t>‘addpath’ to the path the repository is stored in.</w:t>
+      </w:r>
+      <w:r>
+        <w:rPr>
+          <w:lang w:val="en-GB"/>
+        </w:rPr>
+        <w:t>)</w:t>
+      </w:r>
+    </w:p>
+    <w:p>
+      <w:pPr>
+        <w:pStyle w:val="Heading2"/>
+        <w:rPr>
+          <w:lang w:val="en-GB"/>
+        </w:rPr>
+      </w:pPr>
+      <w:r>
+        <w:rPr>
+          <w:lang w:val="en-GB"/>
+        </w:rPr>
+        <w:t>Structure</w:t>
+      </w:r>
+    </w:p>
+    <w:p>
+      <w:pPr>
         <w:rPr>
           <w:lang w:val="en-GB"/>
         </w:rPr>
@@ -255,21 +327,7 @@
         <w:rPr>
           <w:lang w:val="en-GB"/>
         </w:rPr>
-        <w:t xml:space="preserve">from the test model, so they need to be accessible in the </w:t>
-      </w:r>
-      <w:proofErr w:type="spellStart"/>
-      <w:r>
-        <w:rPr>
-          <w:lang w:val="en-GB"/>
-        </w:rPr>
-        <w:t>Matlab</w:t>
-      </w:r>
-      <w:proofErr w:type="spellEnd"/>
-      <w:r>
-        <w:rPr>
-          <w:lang w:val="en-GB"/>
-        </w:rPr>
-        <w:t xml:space="preserve"> path</w:t>
+        <w:t>from the test model, so they need to be accessible in the Matlab path</w:t>
       </w:r>
       <w:r>
         <w:rPr>
@@ -407,16 +465,8 @@
         <w:rPr>
           <w:lang w:val="en-GB"/>
         </w:rPr>
-        <w:t xml:space="preserve">external </w:t>
-      </w:r>
-      <w:proofErr w:type="spellStart"/>
-      <w:r>
-        <w:rPr>
-          <w:lang w:val="en-GB"/>
-        </w:rPr>
-        <w:t>FlexRay</w:t>
-      </w:r>
-      <w:proofErr w:type="spellEnd"/>
+        <w:t>external FlexRay</w:t>
+      </w:r>
       <w:r>
         <w:rPr>
           <w:lang w:val="en-GB"/>
@@ -469,21 +519,7 @@
         <w:rPr>
           <w:lang w:val="en-GB"/>
         </w:rPr>
-        <w:t xml:space="preserve">, </w:t>
-      </w:r>
-      <w:proofErr w:type="spellStart"/>
-      <w:r>
-        <w:rPr>
-          <w:lang w:val="en-GB"/>
-        </w:rPr>
-        <w:t>CarConfig</w:t>
-      </w:r>
-      <w:proofErr w:type="spellEnd"/>
-      <w:r>
-        <w:rPr>
-          <w:lang w:val="en-GB"/>
-        </w:rPr>
-        <w:t xml:space="preserve"> and </w:t>
+        <w:t xml:space="preserve">, CarConfig and </w:t>
       </w:r>
       <w:r>
         <w:rPr>
@@ -567,7 +603,7 @@
                     <pic:cNvPicPr/>
                   </pic:nvPicPr>
                   <pic:blipFill>
-                    <a:blip r:embed="rId6">
+                    <a:blip r:embed="rId10">
                       <a:extLst>
                         <a:ext uri="{28A0092B-C50C-407E-A947-70E740481C1C}">
                           <a14:useLocalDpi xmlns:a14="http://schemas.microsoft.com/office/drawing/2010/main" val="0"/>
@@ -630,21 +666,7 @@
         <w:rPr>
           <w:lang w:val="en-GB"/>
         </w:rPr>
-        <w:t xml:space="preserve">use China or </w:t>
-      </w:r>
-      <w:proofErr w:type="spellStart"/>
-      <w:r>
-        <w:rPr>
-          <w:lang w:val="en-GB"/>
-        </w:rPr>
-        <w:t>RoW</w:t>
-      </w:r>
-      <w:proofErr w:type="spellEnd"/>
-      <w:r>
-        <w:rPr>
-          <w:lang w:val="en-GB"/>
-        </w:rPr>
-        <w:t xml:space="preserve"> functionality.</w:t>
+        <w:t>use China or RoW functionality.</w:t>
       </w:r>
       <w:r>
         <w:rPr>
@@ -656,16 +678,8 @@
         <w:rPr>
           <w:lang w:val="en-GB"/>
         </w:rPr>
-        <w:t xml:space="preserve">Default values are for Argus 3 and </w:t>
-      </w:r>
-      <w:proofErr w:type="spellStart"/>
-      <w:r>
-        <w:rPr>
-          <w:lang w:val="en-GB"/>
-        </w:rPr>
-        <w:t>RoW</w:t>
-      </w:r>
-      <w:proofErr w:type="spellEnd"/>
+        <w:t>Default values are for Argus 3 and RoW</w:t>
+      </w:r>
       <w:r>
         <w:rPr>
           <w:lang w:val="en-GB"/>
@@ -682,21 +696,7 @@
         <w:rPr>
           <w:lang w:val="en-GB"/>
         </w:rPr>
-        <w:t>on the last rows of “</w:t>
-      </w:r>
-      <w:proofErr w:type="spellStart"/>
-      <w:r>
-        <w:rPr>
-          <w:lang w:val="en-GB"/>
-        </w:rPr>
-        <w:t>conf_DSF</w:t>
-      </w:r>
-      <w:proofErr w:type="spellEnd"/>
-      <w:r>
-        <w:rPr>
-          <w:lang w:val="en-GB"/>
-        </w:rPr>
-        <w:t>”</w:t>
+        <w:t>on the last rows of “conf_DSF”</w:t>
       </w:r>
       <w:r>
         <w:rPr>
@@ -722,6 +722,7 @@
           <w:noProof/>
           <w:lang w:val="en-GB"/>
         </w:rPr>
+        <w:lastRenderedPageBreak/>
         <w:drawing>
           <wp:inline distT="0" distB="0" distL="0" distR="0" wp14:anchorId="2093642A" wp14:editId="35B01278">
             <wp:extent cx="2256072" cy="1029661"/>
@@ -738,7 +739,7 @@
                     <pic:cNvPicPr/>
                   </pic:nvPicPr>
                   <pic:blipFill>
-                    <a:blip r:embed="rId7">
+                    <a:blip r:embed="rId11">
                       <a:extLst>
                         <a:ext uri="{28A0092B-C50C-407E-A947-70E740481C1C}">
                           <a14:useLocalDpi xmlns:a14="http://schemas.microsoft.com/office/drawing/2010/main" val="0"/>
@@ -776,7 +777,6 @@
         <w:rPr>
           <w:lang w:val="en-GB"/>
         </w:rPr>
-        <w:lastRenderedPageBreak/>
         <w:t xml:space="preserve">Running the </w:t>
       </w:r>
       <w:r>
@@ -844,41 +844,13 @@
         <w:rPr>
           <w:lang w:val="en-GB"/>
         </w:rPr>
-        <w:t>“</w:t>
-      </w:r>
-      <w:proofErr w:type="spellStart"/>
-      <w:r>
-        <w:rPr>
-          <w:lang w:val="en-GB"/>
-        </w:rPr>
-        <w:t>conf_DSF</w:t>
-      </w:r>
-      <w:proofErr w:type="spellEnd"/>
-      <w:r>
-        <w:rPr>
-          <w:lang w:val="en-GB"/>
-        </w:rPr>
-        <w:t xml:space="preserve">” script – this will </w:t>
-      </w:r>
-      <w:r>
-        <w:rPr>
-          <w:lang w:val="en-GB"/>
-        </w:rPr>
-        <w:t xml:space="preserve">set the </w:t>
-      </w:r>
-      <w:proofErr w:type="spellStart"/>
-      <w:r>
-        <w:rPr>
-          <w:lang w:val="en-GB"/>
-        </w:rPr>
-        <w:t>Matlab</w:t>
-      </w:r>
-      <w:proofErr w:type="spellEnd"/>
-      <w:r>
-        <w:rPr>
-          <w:lang w:val="en-GB"/>
-        </w:rPr>
-        <w:t xml:space="preserve"> path and load all needed</w:t>
+        <w:t xml:space="preserve">“conf_DSF” script – this will </w:t>
+      </w:r>
+      <w:r>
+        <w:rPr>
+          <w:lang w:val="en-GB"/>
+        </w:rPr>
+        <w:t>set the Matlab path and load all needed</w:t>
       </w:r>
       <w:r>
         <w:rPr>
@@ -890,21 +862,7 @@
         <w:rPr>
           <w:lang w:val="en-GB"/>
         </w:rPr>
-        <w:t xml:space="preserve"> and configuration parameters into the </w:t>
-      </w:r>
-      <w:proofErr w:type="spellStart"/>
-      <w:r>
-        <w:rPr>
-          <w:lang w:val="en-GB"/>
-        </w:rPr>
-        <w:t>Matlab</w:t>
-      </w:r>
-      <w:proofErr w:type="spellEnd"/>
-      <w:r>
-        <w:rPr>
-          <w:lang w:val="en-GB"/>
-        </w:rPr>
-        <w:t xml:space="preserve"> workspace. </w:t>
+        <w:t xml:space="preserve"> and configuration parameters into the Matlab workspace. </w:t>
       </w:r>
       <w:r>
         <w:rPr>
@@ -1042,7 +1000,7 @@
                     <pic:cNvPicPr/>
                   </pic:nvPicPr>
                   <pic:blipFill rotWithShape="1">
-                    <a:blip r:embed="rId8">
+                    <a:blip r:embed="rId12">
                       <a:extLst>
                         <a:ext uri="{28A0092B-C50C-407E-A947-70E740481C1C}">
                           <a14:useLocalDpi xmlns:a14="http://schemas.microsoft.com/office/drawing/2010/main" val="0"/>
@@ -1204,7 +1162,7 @@
                     <pic:cNvPicPr/>
                   </pic:nvPicPr>
                   <pic:blipFill>
-                    <a:blip r:embed="rId9" cstate="print">
+                    <a:blip r:embed="rId13" cstate="print">
                       <a:extLst>
                         <a:ext uri="{28A0092B-C50C-407E-A947-70E740481C1C}">
                           <a14:useLocalDpi xmlns:a14="http://schemas.microsoft.com/office/drawing/2010/main" val="0"/>
@@ -1433,6 +1391,7 @@
         <w:rPr>
           <w:lang w:val="en-GB"/>
         </w:rPr>
+        <w:lastRenderedPageBreak/>
         <w:t xml:space="preserve">To the right of this there are </w:t>
       </w:r>
       <w:r>
@@ -1505,7 +1464,6 @@
         <w:rPr>
           <w:lang w:val="en-GB"/>
         </w:rPr>
-        <w:lastRenderedPageBreak/>
         <w:t xml:space="preserve">To the bottom right </w:t>
       </w:r>
       <w:r>
@@ -1692,7 +1650,7 @@
                     <pic:cNvPicPr/>
                   </pic:nvPicPr>
                   <pic:blipFill>
-                    <a:blip r:embed="rId10">
+                    <a:blip r:embed="rId14">
                       <a:extLst>
                         <a:ext uri="{28A0092B-C50C-407E-A947-70E740481C1C}">
                           <a14:useLocalDpi xmlns:a14="http://schemas.microsoft.com/office/drawing/2010/main" val="0"/>
@@ -1755,21 +1713,7 @@
         <w:rPr>
           <w:lang w:val="en-GB"/>
         </w:rPr>
-        <w:t xml:space="preserve">start </w:t>
-      </w:r>
-      <w:proofErr w:type="spellStart"/>
-      <w:r>
-        <w:rPr>
-          <w:lang w:val="en-GB"/>
-        </w:rPr>
-        <w:t>CANoe</w:t>
-      </w:r>
-      <w:proofErr w:type="spellEnd"/>
-      <w:r>
-        <w:rPr>
-          <w:lang w:val="en-GB"/>
-        </w:rPr>
-        <w:t xml:space="preserve"> </w:t>
+        <w:t xml:space="preserve">start CANoe </w:t>
       </w:r>
       <w:r>
         <w:rPr>
@@ -1805,16 +1749,8 @@
         <w:rPr>
           <w:lang w:val="en-GB"/>
         </w:rPr>
-        <w:t>a (</w:t>
-      </w:r>
-      <w:proofErr w:type="spellStart"/>
-      <w:r>
-        <w:rPr>
-          <w:lang w:val="en-GB"/>
-        </w:rPr>
-        <w:t>FlexRay</w:t>
-      </w:r>
-      <w:proofErr w:type="spellEnd"/>
+        <w:t>a (FlexRay</w:t>
+      </w:r>
       <w:r>
         <w:rPr>
           <w:lang w:val="en-GB"/>
@@ -1849,21 +1785,7 @@
         <w:rPr>
           <w:lang w:val="en-GB"/>
         </w:rPr>
-        <w:t xml:space="preserve">trigger the </w:t>
-      </w:r>
-      <w:proofErr w:type="spellStart"/>
-      <w:r>
-        <w:rPr>
-          <w:lang w:val="en-GB"/>
-        </w:rPr>
-        <w:t>CANoe</w:t>
-      </w:r>
-      <w:proofErr w:type="spellEnd"/>
-      <w:r>
-        <w:rPr>
-          <w:lang w:val="en-GB"/>
-        </w:rPr>
-        <w:t xml:space="preserve"> simulation to </w:t>
+        <w:t xml:space="preserve">trigger the CANoe simulation to </w:t>
       </w:r>
       <w:r>
         <w:rPr>
@@ -1913,21 +1835,7 @@
         <w:rPr>
           <w:lang w:val="en-GB"/>
         </w:rPr>
-        <w:t xml:space="preserve">, the </w:t>
-      </w:r>
-      <w:proofErr w:type="spellStart"/>
-      <w:r>
-        <w:rPr>
-          <w:lang w:val="en-GB"/>
-        </w:rPr>
-        <w:t>CarConfig</w:t>
-      </w:r>
-      <w:proofErr w:type="spellEnd"/>
-      <w:r>
-        <w:rPr>
-          <w:lang w:val="en-GB"/>
-        </w:rPr>
-        <w:t xml:space="preserve"> parameters </w:t>
+        <w:t xml:space="preserve">, the CarConfig parameters </w:t>
       </w:r>
       <w:r>
         <w:rPr>
@@ -1941,19 +1849,11 @@
         </w:rPr>
         <w:t xml:space="preserve"> be controlled via the </w:t>
       </w:r>
-      <w:proofErr w:type="spellStart"/>
-      <w:r>
-        <w:rPr>
-          <w:lang w:val="en-GB"/>
-        </w:rPr>
-        <w:t>CANoe</w:t>
-      </w:r>
-      <w:proofErr w:type="spellEnd"/>
-      <w:r>
-        <w:rPr>
-          <w:lang w:val="en-GB"/>
-        </w:rPr>
-        <w:t xml:space="preserve"> interface</w:t>
+      <w:r>
+        <w:rPr>
+          <w:lang w:val="en-GB"/>
+        </w:rPr>
+        <w:t>CANoe interface</w:t>
       </w:r>
       <w:r>
         <w:rPr>
@@ -1991,6 +1891,7 @@
           <w:noProof/>
           <w:lang w:val="en-GB"/>
         </w:rPr>
+        <w:lastRenderedPageBreak/>
         <mc:AlternateContent>
           <mc:Choice Requires="wps">
             <w:drawing>
@@ -2091,7 +1992,7 @@
                     <pic:cNvPicPr/>
                   </pic:nvPicPr>
                   <pic:blipFill>
-                    <a:blip r:embed="rId11" cstate="print">
+                    <a:blip r:embed="rId15" cstate="print">
                       <a:extLst>
                         <a:ext uri="{28A0092B-C50C-407E-A947-70E740481C1C}">
                           <a14:useLocalDpi xmlns:a14="http://schemas.microsoft.com/office/drawing/2010/main" val="0"/>
@@ -2128,7 +2029,6 @@
         <w:rPr>
           <w:lang w:val="en-GB"/>
         </w:rPr>
-        <w:lastRenderedPageBreak/>
         <w:t xml:space="preserve">Driver interaction </w:t>
       </w:r>
       <w:r>
@@ -2375,7 +2275,7 @@
                     <pic:cNvPicPr/>
                   </pic:nvPicPr>
                   <pic:blipFill>
-                    <a:blip r:embed="rId12">
+                    <a:blip r:embed="rId16">
                       <a:extLst>
                         <a:ext uri="{28A0092B-C50C-407E-A947-70E740481C1C}">
                           <a14:useLocalDpi xmlns:a14="http://schemas.microsoft.com/office/drawing/2010/main" val="0"/>
@@ -2475,7 +2375,7 @@
                     <pic:cNvPicPr/>
                   </pic:nvPicPr>
                   <pic:blipFill>
-                    <a:blip r:embed="rId13">
+                    <a:blip r:embed="rId17">
                       <a:extLst>
                         <a:ext uri="{28A0092B-C50C-407E-A947-70E740481C1C}">
                           <a14:useLocalDpi xmlns:a14="http://schemas.microsoft.com/office/drawing/2010/main" val="0"/>
@@ -3545,6 +3445,38 @@
       <w:spacing w:val="5"/>
     </w:rPr>
   </w:style>
+  <w:style w:type="character" w:styleId="Hyperlink">
+    <w:name w:val="Hyperlink"/>
+    <w:basedOn w:val="DefaultParagraphFont"/>
+    <w:uiPriority w:val="99"/>
+    <w:unhideWhenUsed/>
+    <w:rsid w:val="0090506F"/>
+    <w:rPr>
+      <w:color w:val="467886" w:themeColor="hyperlink"/>
+      <w:u w:val="single"/>
+    </w:rPr>
+  </w:style>
+  <w:style w:type="character" w:styleId="UnresolvedMention">
+    <w:name w:val="Unresolved Mention"/>
+    <w:basedOn w:val="DefaultParagraphFont"/>
+    <w:uiPriority w:val="99"/>
+    <w:semiHidden/>
+    <w:unhideWhenUsed/>
+    <w:rsid w:val="0090506F"/>
+    <w:rPr>
+      <w:color w:val="605E5C"/>
+      <w:shd w:val="clear" w:color="auto" w:fill="E1DFDD"/>
+    </w:rPr>
+  </w:style>
+  <w:style w:type="paragraph" w:styleId="NoSpacing">
+    <w:name w:val="No Spacing"/>
+    <w:uiPriority w:val="1"/>
+    <w:qFormat/>
+    <w:rsid w:val="00BE239A"/>
+    <w:pPr>
+      <w:spacing w:after="0" w:line="240" w:lineRule="auto"/>
+    </w:pPr>
+  </w:style>
 </w:styles>
 </file>
 
@@ -3864,10 +3796,28 @@
 </file>
 
 <file path=customXml/item1.xml><?xml version="1.0" encoding="utf-8"?>
-<b:Sources xmlns:b="http://schemas.openxmlformats.org/officeDocument/2006/bibliography" xmlns="http://schemas.openxmlformats.org/officeDocument/2006/bibliography" SelectedStyle="\APASixthEditionOfficeOnline.xsl" StyleName="APA" Version="6"/>
+<p:properties xmlns:p="http://schemas.microsoft.com/office/2006/metadata/properties" xmlns:xsi="http://www.w3.org/2001/XMLSchema-instance" xmlns:pc="http://schemas.microsoft.com/office/infopath/2007/PartnerControls">
+  <documentManagement>
+    <_ip_UnifiedCompliancePolicyUIAction xmlns="http://schemas.microsoft.com/sharepoint/v3" xsi:nil="true"/>
+    <lcf76f155ced4ddcb4097134ff3c332f xmlns="13d431d4-2449-4fb8-acba-32499d8e1d4d">
+      <Terms xmlns="http://schemas.microsoft.com/office/infopath/2007/PartnerControls"/>
+    </lcf76f155ced4ddcb4097134ff3c332f>
+    <_ip_UnifiedCompliancePolicyProperties xmlns="http://schemas.microsoft.com/sharepoint/v3" xsi:nil="true"/>
+    <TaxCatchAll xmlns="5195f0c8-3e44-41dc-b877-03e967f10b1e" xsi:nil="true"/>
+  </documentManagement>
+</p:properties>
 </file>
 
 <file path=customXml/item2.xml><?xml version="1.0" encoding="utf-8"?>
+<?mso-contentType ?>
+<FormTemplates xmlns="http://schemas.microsoft.com/sharepoint/v3/contenttype/forms">
+  <Display>DocumentLibraryForm</Display>
+  <Edit>DocumentLibraryForm</Edit>
+  <New>DocumentLibraryForm</New>
+</FormTemplates>
+</file>
+
+<file path=customXml/item3.xml><?xml version="1.0" encoding="utf-8"?>
 <ct:contentTypeSchema xmlns:ct="http://schemas.microsoft.com/office/2006/metadata/contentType" xmlns:ma="http://schemas.microsoft.com/office/2006/metadata/properties/metaAttributes" ct:_="" ma:_="" ma:contentTypeName="Document" ma:contentTypeID="0x01010066C087209B2D0B47BEE0252D8DED7A25" ma:contentTypeVersion="19" ma:contentTypeDescription="Create a new document." ma:contentTypeScope="" ma:versionID="81a745d6f27927978f67659c7c158892">
   <xsd:schema xmlns:xsd="http://www.w3.org/2001/XMLSchema" xmlns:xs="http://www.w3.org/2001/XMLSchema" xmlns:p="http://schemas.microsoft.com/office/2006/metadata/properties" xmlns:ns1="http://schemas.microsoft.com/sharepoint/v3" xmlns:ns2="13d431d4-2449-4fb8-acba-32499d8e1d4d" xmlns:ns3="5195f0c8-3e44-41dc-b877-03e967f10b1e" targetNamespace="http://schemas.microsoft.com/office/2006/metadata/properties" ma:root="true" ma:fieldsID="ece95fea8e7020cceaad7cbb9182fbff" ns1:_="" ns2:_="" ns3:_="">
     <xsd:import namespace="http://schemas.microsoft.com/sharepoint/v3"/>
@@ -4133,29 +4083,51 @@
 </ct:contentTypeSchema>
 </file>
 
-<file path=customXml/item3.xml><?xml version="1.0" encoding="utf-8"?>
-<?mso-contentType ?>
-<FormTemplates xmlns="http://schemas.microsoft.com/sharepoint/v3/contenttype/forms">
-  <Display>DocumentLibraryForm</Display>
-  <Edit>DocumentLibraryForm</Edit>
-  <New>DocumentLibraryForm</New>
-</FormTemplates>
-</file>
-
 <file path=customXml/item4.xml><?xml version="1.0" encoding="utf-8"?>
-<p:properties xmlns:p="http://schemas.microsoft.com/office/2006/metadata/properties" xmlns:xsi="http://www.w3.org/2001/XMLSchema-instance" xmlns:pc="http://schemas.microsoft.com/office/infopath/2007/PartnerControls">
-  <documentManagement>
-    <_ip_UnifiedCompliancePolicyUIAction xmlns="http://schemas.microsoft.com/sharepoint/v3" xsi:nil="true"/>
-    <lcf76f155ced4ddcb4097134ff3c332f xmlns="13d431d4-2449-4fb8-acba-32499d8e1d4d">
-      <Terms xmlns="http://schemas.microsoft.com/office/infopath/2007/PartnerControls"/>
-    </lcf76f155ced4ddcb4097134ff3c332f>
-    <_ip_UnifiedCompliancePolicyProperties xmlns="http://schemas.microsoft.com/sharepoint/v3" xsi:nil="true"/>
-    <TaxCatchAll xmlns="5195f0c8-3e44-41dc-b877-03e967f10b1e" xsi:nil="true"/>
-  </documentManagement>
-</p:properties>
+<b:Sources xmlns:b="http://schemas.openxmlformats.org/officeDocument/2006/bibliography" xmlns="http://schemas.openxmlformats.org/officeDocument/2006/bibliography" SelectedStyle="\APASixthEditionOfficeOnline.xsl" StyleName="APA" Version="6"/>
 </file>
 
 <file path=customXml/itemProps1.xml><?xml version="1.0" encoding="utf-8"?>
+<ds:datastoreItem xmlns:ds="http://schemas.openxmlformats.org/officeDocument/2006/customXml" ds:itemID="{01D87AFD-172A-4CEF-9C7C-692E47409430}">
+  <ds:schemaRefs>
+    <ds:schemaRef ds:uri="http://schemas.microsoft.com/office/2006/metadata/properties"/>
+    <ds:schemaRef ds:uri="http://schemas.microsoft.com/office/infopath/2007/PartnerControls"/>
+    <ds:schemaRef ds:uri="http://schemas.microsoft.com/sharepoint/v3"/>
+    <ds:schemaRef ds:uri="13d431d4-2449-4fb8-acba-32499d8e1d4d"/>
+    <ds:schemaRef ds:uri="5195f0c8-3e44-41dc-b877-03e967f10b1e"/>
+  </ds:schemaRefs>
+</ds:datastoreItem>
+</file>
+
+<file path=customXml/itemProps2.xml><?xml version="1.0" encoding="utf-8"?>
+<ds:datastoreItem xmlns:ds="http://schemas.openxmlformats.org/officeDocument/2006/customXml" ds:itemID="{CC0F2BAB-32C9-4FBF-BD9E-7C89883AF7E5}">
+  <ds:schemaRefs>
+    <ds:schemaRef ds:uri="http://schemas.microsoft.com/sharepoint/v3/contenttype/forms"/>
+  </ds:schemaRefs>
+</ds:datastoreItem>
+</file>
+
+<file path=customXml/itemProps3.xml><?xml version="1.0" encoding="utf-8"?>
+<ds:datastoreItem xmlns:ds="http://schemas.openxmlformats.org/officeDocument/2006/customXml" ds:itemID="{DC9828C9-5903-42F9-AA38-8C2D2A68FD64}">
+  <ds:schemaRefs>
+    <ds:schemaRef ds:uri="http://schemas.microsoft.com/office/2006/metadata/contentType"/>
+    <ds:schemaRef ds:uri="http://schemas.microsoft.com/office/2006/metadata/properties/metaAttributes"/>
+    <ds:schemaRef ds:uri="http://www.w3.org/2001/XMLSchema"/>
+    <ds:schemaRef ds:uri="http://schemas.microsoft.com/office/2006/metadata/properties"/>
+    <ds:schemaRef ds:uri="http://schemas.microsoft.com/sharepoint/v3"/>
+    <ds:schemaRef ds:uri="13d431d4-2449-4fb8-acba-32499d8e1d4d"/>
+    <ds:schemaRef ds:uri="5195f0c8-3e44-41dc-b877-03e967f10b1e"/>
+    <ds:schemaRef ds:uri="http://schemas.microsoft.com/office/2006/documentManagement/types"/>
+    <ds:schemaRef ds:uri="http://schemas.microsoft.com/office/infopath/2007/PartnerControls"/>
+    <ds:schemaRef ds:uri="http://schemas.openxmlformats.org/package/2006/metadata/core-properties"/>
+    <ds:schemaRef ds:uri="http://purl.org/dc/elements/1.1/"/>
+    <ds:schemaRef ds:uri="http://purl.org/dc/terms/"/>
+    <ds:schemaRef ds:uri="http://schemas.microsoft.com/internal/obd"/>
+  </ds:schemaRefs>
+</ds:datastoreItem>
+</file>
+
+<file path=customXml/itemProps4.xml><?xml version="1.0" encoding="utf-8"?>
 <ds:datastoreItem xmlns:ds="http://schemas.openxmlformats.org/officeDocument/2006/customXml" ds:itemID="{21C7B5B5-E16D-4A0E-AFCB-6236B688E8CE}">
   <ds:schemaRefs>
     <ds:schemaRef ds:uri="http://schemas.openxmlformats.org/officeDocument/2006/bibliography"/>
@@ -4163,18 +4135,6 @@
 </ds:datastoreItem>
 </file>
 
-<file path=customXml/itemProps2.xml><?xml version="1.0" encoding="utf-8"?>
-<ds:datastoreItem xmlns:ds="http://schemas.openxmlformats.org/officeDocument/2006/customXml" ds:itemID="{DC9828C9-5903-42F9-AA38-8C2D2A68FD64}"/>
-</file>
-
-<file path=customXml/itemProps3.xml><?xml version="1.0" encoding="utf-8"?>
-<ds:datastoreItem xmlns:ds="http://schemas.openxmlformats.org/officeDocument/2006/customXml" ds:itemID="{CC0F2BAB-32C9-4FBF-BD9E-7C89883AF7E5}"/>
-</file>
-
-<file path=customXml/itemProps4.xml><?xml version="1.0" encoding="utf-8"?>
-<ds:datastoreItem xmlns:ds="http://schemas.openxmlformats.org/officeDocument/2006/customXml" ds:itemID="{01D87AFD-172A-4CEF-9C7C-692E47409430}"/>
-</file>
-
 <file path=docMetadata/LabelInfo.xml><?xml version="1.0" encoding="utf-8"?>
 <clbl:labelList xmlns:clbl="http://schemas.microsoft.com/office/2020/mipLabelMetadata">
   <clbl:label id="{7fea2623-af8f-4fb8-b1cf-b63cc8e496aa}" enabled="1" method="Standard" siteId="{81fa766e-a349-4867-8bf4-ab35e250a08f}" removed="0"/>

</xml_diff>